<commit_message>
Refactor Consumer Insight Portal (CIP) schema from `dwh_stg` to `cip_stg`
- Updated documentation to reflect the new schema and table prefixes.
- Modified API connection details to point to `cip_stg`.
- Adjusted data dictionary generation script for the new schema.
- Created a new script to drop CIP tables and views from `dwh_stg` after verifying their existence in `cip_stg`.
- Updated setup and grants scripts to align with the new schema.
- Ensured all references to `dwh_stg` are replaced with `cip_stg` in relevant SQL files.
</commit_message>
<xml_diff>
--- a/docs/CIP-Business-Description.docx
+++ b/docs/CIP-Business-Description.docx
@@ -42,7 +42,7 @@
       </w:pPr>
       <w:r>
         <w:rPr/>
-        <w:t xml:space="preserve">October 13, 2026</w:t>
+        <w:t xml:space="preserve">October 14, 2026</w:t>
       </w:r>
     </w:p>
     <w:p>
@@ -449,11 +449,11 @@
       </w:pPr>
       <w:r>
         <w:rPr/>
-        <w:t xml:space="preserve">Everything is stored in the company data warehouse (</w:t>
-      </w:r>
-      <w:r>
-        <w:rPr/>
-        <w:t xml:space="preserve">dwh_stg</w:t>
+        <w:t xml:space="preserve">Everything is stored in the company data warehouse (database </w:t>
+      </w:r>
+      <w:r>
+        <w:rPr/>
+        <w:t xml:space="preserve">cip_stg</w:t>
       </w:r>
       <w:r>
         <w:rPr/>
@@ -859,14 +859,14 @@
         <w:rPr/>
         <w:drawing>
           <wp:inline distB="0" distL="0" distR="0" distT="0">
-            <wp:extent cx="5486400" cy="860943"/>
+            <wp:extent cx="5486400" cy="860342"/>
             <wp:effectExtent b="0" l="0" r="0" t="0"/>
-            <wp:docPr id="2" name="image-80yRQw8gkXvXtVpIErs83.png"/>
+            <wp:docPr id="2" name="image-jMnVFxnyKxe60IqJe60sw.png"/>
             <a:graphic>
               <a:graphicData uri="http://schemas.openxmlformats.org/drawingml/2006/picture">
                 <pic:pic>
                   <pic:nvPicPr>
-                    <pic:cNvPr id="2" name="image-80yRQw8gkXvXtVpIErs83.png" descr="The business process, end to end — flowchart diagram"/>
+                    <pic:cNvPr id="2" name="image-jMnVFxnyKxe60IqJe60sw.png" descr="The business process, end to end — flowchart diagram"/>
                     <pic:cNvPicPr/>
                   </pic:nvPicPr>
                   <pic:blipFill>
@@ -879,7 +879,7 @@
                   <pic:spPr>
                     <a:xfrm>
                       <a:off x="0" y="0"/>
-                      <a:ext cx="5486400" cy="860943"/>
+                      <a:ext cx="5486400" cy="860342"/>
                     </a:xfrm>
                     <a:prstGeom prst="rect"/>
                   </pic:spPr>
@@ -1839,12 +1839,12 @@
           <wp:inline distB="0" distL="0" distR="0" distT="0">
             <wp:extent cx="5486400" cy="531759"/>
             <wp:effectExtent b="0" l="0" r="0" t="0"/>
-            <wp:docPr id="4" name="image-f4S9On2ocLNjiZINe7i3p.png"/>
+            <wp:docPr id="4" name="image-SRgQMlySpAShj-Cq6Xkno.png"/>
             <a:graphic>
               <a:graphicData uri="http://schemas.openxmlformats.org/drawingml/2006/picture">
                 <pic:pic>
                   <pic:nvPicPr>
-                    <pic:cNvPr id="4" name="image-f4S9On2ocLNjiZINe7i3p.png" descr="The 12-week sector rotation and its paired topics — flowchart diagram"/>
+                    <pic:cNvPr id="4" name="image-SRgQMlySpAShj-Cq6Xkno.png" descr="The 12-week sector rotation and its paired topics — flowchart diagram"/>
                     <pic:cNvPicPr/>
                   </pic:nvPicPr>
                   <pic:blipFill>
@@ -3792,12 +3792,12 @@
           <wp:inline distB="0" distL="0" distR="0" distT="0">
             <wp:extent cx="5486400" cy="3429000"/>
             <wp:effectExtent b="0" l="0" r="0" t="0"/>
-            <wp:docPr id="5" name="image-U5MZlFVn9kVYsfySFPCsM.png"/>
+            <wp:docPr id="5" name="image-Hwfc57AxgD1nXhhjx3qUK.png"/>
             <a:graphic>
               <a:graphicData uri="http://schemas.openxmlformats.org/drawingml/2006/picture">
                 <pic:pic>
                   <pic:nvPicPr>
-                    <pic:cNvPr id="5" name="image-U5MZlFVn9kVYsfySFPCsM.png" descr="Life of a survey in the pipeline — flowchart diagram"/>
+                    <pic:cNvPr id="5" name="image-Hwfc57AxgD1nXhhjx3qUK.png" descr="Life of a survey in the pipeline — flowchart diagram"/>
                     <pic:cNvPicPr/>
                   </pic:nvPicPr>
                   <pic:blipFill>
@@ -6332,12 +6332,12 @@
           <wp:inline distB="0" distL="0" distR="0" distT="0">
             <wp:extent cx="2798064" cy="6769880"/>
             <wp:effectExtent b="0" l="0" r="0" t="0"/>
-            <wp:docPr id="6" name="image-uRO4_OLBRoPZX9OB0ULED.png"/>
+            <wp:docPr id="6" name="image-eVcFO9MQwVgXA2bE1RDQm.png"/>
             <a:graphic>
               <a:graphicData uri="http://schemas.openxmlformats.org/drawingml/2006/picture">
                 <pic:pic>
                   <pic:nvPicPr>
-                    <pic:cNvPr id="6" name="image-uRO4_OLBRoPZX9OB0ULED.png" descr="One scheduled run — flowchart diagram"/>
+                    <pic:cNvPr id="6" name="image-eVcFO9MQwVgXA2bE1RDQm.png" descr="One scheduled run — flowchart diagram"/>
                     <pic:cNvPicPr/>
                   </pic:nvPicPr>
                   <pic:blipFill>

</xml_diff>